<commit_message>
Add transfusion protocol and responsive image lightbox
</commit_message>
<xml_diff>
--- a/codigo ayuda.docx
+++ b/codigo ayuda.docx
@@ -114,6 +114,154 @@
       </w:tr>
     </w:tbl>
     <w:p/>
+    <w:p/>
+    <w:tbl>
+      <w:tblPr>
+        <w:tblStyle w:val="Tablaconcuadrcula"/>
+        <w:tblW w:w="0" w:type="auto"/>
+        <w:tblLook w:val="04A0" w:firstRow="1" w:lastRow="0" w:firstColumn="1" w:lastColumn="0" w:noHBand="0" w:noVBand="1"/>
+      </w:tblPr>
+      <w:tblGrid>
+        <w:gridCol w:w="8494"/>
+      </w:tblGrid>
+      <w:tr>
+        <w:tc>
+          <w:tcPr>
+            <w:tcW w:w="8494" w:type="dxa"/>
+          </w:tcPr>
+          <w:p>
+            <w:r>
+              <w:t>Abrir Chat GPT Codex</w:t>
+            </w:r>
+          </w:p>
+        </w:tc>
+      </w:tr>
+      <w:tr>
+        <w:tc>
+          <w:tcPr>
+            <w:tcW w:w="8494" w:type="dxa"/>
+          </w:tcPr>
+          <w:p>
+            <w:pPr>
+              <w:rPr>
+                <w:b/>
+                <w:bCs/>
+              </w:rPr>
+            </w:pPr>
+            <w:r>
+              <w:rPr>
+                <w:b/>
+                <w:bCs/>
+              </w:rPr>
+              <w:t>Convertir a Word:</w:t>
+            </w:r>
+          </w:p>
+          <w:p>
+            <w:r>
+              <w:t>Mejor a mano, y las imágenes a mano en media</w:t>
+            </w:r>
+          </w:p>
+          <w:p>
+            <w:pPr>
+              <w:rPr>
+                <w:b/>
+                <w:bCs/>
+              </w:rPr>
+            </w:pPr>
+            <w:r>
+              <w:t>/</w:t>
+            </w:r>
+            <w:r>
+              <w:t>matriz/media/</w:t>
+            </w:r>
+            <w:r>
+              <w:rPr>
+                <w:i/>
+                <w:iCs/>
+              </w:rPr>
+              <w:t>nombre_archivo_</w:t>
+            </w:r>
+            <w:r>
+              <w:t>image2</w:t>
+            </w:r>
+          </w:p>
+          <w:p>
+            <w:pPr>
+              <w:rPr>
+                <w:b/>
+                <w:bCs/>
+              </w:rPr>
+            </w:pPr>
+            <w:r>
+              <w:rPr>
+                <w:b/>
+                <w:bCs/>
+              </w:rPr>
+              <w:t>Desplegar:</w:t>
+            </w:r>
+          </w:p>
+          <w:p>
+            <w:pPr>
+              <w:rPr>
+                <w:lang w:val="en-US"/>
+              </w:rPr>
+            </w:pPr>
+            <w:r>
+              <w:rPr>
+                <w:lang w:val="en-US"/>
+              </w:rPr>
+              <w:t>.\deploy.ps1 -Message "</w:t>
+            </w:r>
+            <w:r>
+              <w:rPr>
+                <w:lang w:val="en-US"/>
+              </w:rPr>
+              <w:t>aquiponloquequieras</w:t>
+            </w:r>
+            <w:r>
+              <w:rPr>
+                <w:lang w:val="en-US"/>
+              </w:rPr>
+              <w:t>"</w:t>
+            </w:r>
+          </w:p>
+          <w:p>
+            <w:pPr>
+              <w:rPr>
+                <w:lang w:val="en-US"/>
+              </w:rPr>
+            </w:pPr>
+          </w:p>
+        </w:tc>
+      </w:tr>
+    </w:tbl>
+    <w:p>
+      <w:pPr>
+        <w:rPr>
+          <w:lang w:val="en-US"/>
+        </w:rPr>
+      </w:pPr>
+    </w:p>
+    <w:p>
+      <w:pPr>
+        <w:rPr>
+          <w:lang w:val="en-US"/>
+        </w:rPr>
+      </w:pPr>
+      <w:r>
+        <w:rPr>
+          <w:lang w:val="en-US"/>
+        </w:rPr>
+        <w:br w:type="page"/>
+      </w:r>
+    </w:p>
+    <w:p>
+      <w:pPr>
+        <w:rPr>
+          <w:lang w:val="en-US"/>
+        </w:rPr>
+      </w:pPr>
+    </w:p>
     <w:tbl>
       <w:tblPr>
         <w:tblStyle w:val="Tablaconcuadrcula"/>
@@ -566,6 +714,7 @@
                 <w:b/>
                 <w:bCs/>
               </w:rPr>
+              <w:lastRenderedPageBreak/>
               <w:t>Step 2:</w:t>
             </w:r>
           </w:p>
@@ -1092,6 +1241,7 @@
                 <w:b/>
                 <w:bCs/>
               </w:rPr>
+              <w:lastRenderedPageBreak/>
               <w:t xml:space="preserve">Step </w:t>
             </w:r>
             <w:r>
@@ -1450,7 +1600,6 @@
           </w:tcPr>
           <w:p>
             <w:r>
-              <w:lastRenderedPageBreak/>
               <w:t>Cosas html (como los colores)</w:t>
             </w:r>
           </w:p>
@@ -2325,7 +2474,6 @@
   <w:style w:type="character" w:default="1" w:styleId="Fuentedeprrafopredeter">
     <w:name w:val="Default Paragraph Font"/>
     <w:uiPriority w:val="1"/>
-    <w:semiHidden/>
     <w:unhideWhenUsed/>
   </w:style>
   <w:style w:type="table" w:default="1" w:styleId="Tablanormal">

</xml_diff>